<commit_message>
feat(sorular): GMY Deneme 11–15 (5 × 100 soru, 2021–2025 sınavlarının ikinci karşılığı)
- 20 genel kültür + 80 gümrük; Deneme 11 ← 2021 … Deneme 15 ← 2025 B kitapçığı sırası
- Prompt 4 tip planı, Prompt 3 kök kuralları, GMY kapsamı (GY m.567/2)
- Önceki 1015 hafıza satırı ve Deneme 6–10 karşılıkları tekrar edilmedi
- V1–V6 çekişmeli doğrulama, S1–S2 son doğrulama, örtüşme/ipucu taramaları
- Çıktılar: sorular/GK_GMY_Deneme11–15_100soru.md/.docx; hafıza 1515 satır

Co-Authored-By: Claude Opus 5.5 <noreply@anthropic.com>
Claude-Session: https://claude.ai/code/session_0135MFkKzvBLeQJt4U9kFfLt
</commit_message>
<xml_diff>
--- a/sorular/GK_GMY_Deneme11_100soru.docx
+++ b/sorular/GK_GMY_Deneme11_100soru.docx
@@ -3094,7 +3094,7 @@
         <w:t xml:space="preserve">26. </w:t>
       </w:r>
       <w:r>
-        <w:t xml:space="preserve">Gümrük Yönetmeliğinin ekonomik etkili gümrük rejimlerine ilişkin bölümünde yapılan tanımlara göre, "üçgen trafik" deyimi aşağıdakilerden hangisini ifade eder?</w:t>
+        <w:t xml:space="preserve">4458 sayılı Gümrük Kanununun “Amaç, Kapsam ve Temel Tanımlar” bölümünde yer alan tanımlara göre, “karar” deyimi aşağıdakilerden hangisini ifade eder?</w:t>
       </w:r>
     </w:p>
     <w:p>
@@ -3107,7 +3107,7 @@
         <w:t xml:space="preserve">A) </w:t>
       </w:r>
       <w:r>
-        <w:t xml:space="preserve">Rejime giriş ve rejimi kapatan gümrük idarelerinin her ikisinin de Türkiye Gümrük Bölgesinde bulunması kaydıyla, bu idarelerin birbirinden farklı olduğu durumu</w:t>
+        <w:t xml:space="preserve">Bağlayıcı tarife ve menşe bilgileri hariç olmak üzere, gümrük idaresinin belirli bir konuda bir kişi üzerinde hukuki sonuç doğuracak idari tasarrufu</w:t>
       </w:r>
     </w:p>
     <w:p>
@@ -3120,7 +3120,7 @@
         <w:t xml:space="preserve">B) </w:t>
       </w:r>
       <w:r>
-        <w:t xml:space="preserve">Rejime giriş gümrük idaresi ile denetleyici gümrük idaresinin farklı olduğu ve izin belgesinin üçüncü bir gümrük idaresince verildiği durumu</w:t>
+        <w:t xml:space="preserve">Gümrük idaresinin, belirli bir kişiye yönelmeksizin gümrük mevzuatının uygulanmasına ilişkin herkes için yayımladığı genel düzenlemeyi</w:t>
       </w:r>
     </w:p>
     <w:p>
@@ -3133,7 +3133,7 @@
         <w:t xml:space="preserve">C) </w:t>
       </w:r>
       <w:r>
-        <w:t xml:space="preserve">İşlem görmüş ürünlerin, rejime girişin yapıldığı gümrük idaresinden farklı bir gümrük idaresince serbest dolaşıma sokulduğu durumu</w:t>
+        <w:t xml:space="preserve">Gümrük idaresinin, ilgilinin talebi üzerine belirli bir eşya hakkında verdiği, hukuki sonuç doğurmayan yol gösterici bilgiyi</w:t>
       </w:r>
     </w:p>
     <w:p>
@@ -3146,7 +3146,7 @@
         <w:t xml:space="preserve">D) </w:t>
       </w:r>
       <w:r>
-        <w:t xml:space="preserve">Rejime giriş, rejimi kapatan ve denetleyici gümrük idarelerinin izin belgesinde birbirinden farklı üç idare olarak belirlendiği durumu</w:t>
+        <w:t xml:space="preserve">Gümrük idaresinin, gümrük mevzuatıyla ilgili belirli bir konuda yalnız başvuru sahibinin lehine hukuki sonuç doğuracak idari tasarrufu</w:t>
       </w:r>
     </w:p>
     <w:p>
@@ -3159,7 +3159,7 @@
         <w:t xml:space="preserve">E) </w:t>
       </w:r>
       <w:r>
-        <w:t xml:space="preserve">Gümrük idarelerinden yalnız birinin Türkiye Gümrük Bölgesinde olması kaydıyla, rejime giriş ve rejimi kapatan gümrük idarelerinin farklı olduğu durumu</w:t>
+        <w:t xml:space="preserve">Gümrük idaresinin, gümrük mevzuatıyla ilgili belirli bir konuda bir veya daha fazla kişi üzerinde hukuki sonuç doğuracak idari tasarrufu</w:t>
       </w:r>
     </w:p>
     <w:p>
@@ -9030,7 +9030,7 @@
         <w:t xml:space="preserve">85. </w:t>
       </w:r>
       <w:r>
-        <w:t xml:space="preserve">Gümrük mevzuatına göre, kamu kurumu adına tescilli beyannamede müşavirlik hizmet faturası </w:t>
+        <w:t xml:space="preserve">Asgari Ücret Tarifesine İlişkin Tebliğe göre, kamu kurumu adına tescilli beyannamede müşavirlik hizmet faturası </w:t>
       </w:r>
       <w:r>
         <w:rPr>
@@ -9121,7 +9121,7 @@
         <w:t xml:space="preserve">86. </w:t>
       </w:r>
       <w:r>
-        <w:t xml:space="preserve">Gümrük mevzuatına göre, asgari ücret tarifesindeki İHR-6 (ihrakiye ve kumanya) ücretleri </w:t>
+        <w:t xml:space="preserve">Asgari Ücret Tarifesine İlişkin Tebliğe göre, İHR-6 (ihrakiye ve kumanya) ücretleri </w:t>
       </w:r>
       <w:r>
         <w:rPr>
@@ -20618,7 +20618,7 @@
         <w:spacing w:after="80" w:before="40"/>
       </w:pPr>
       <w:r>
-        <w:t xml:space="preserve">Gümrük Yönetmeliğinin ekonomik etkili gümrük rejimlerine ilişkin bölümünde yapılan tanımlara göre, "üçgen trafik" deyimi aşağıdakilerden hangisini ifade eder?</w:t>
+        <w:t xml:space="preserve">4458 sayılı Gümrük Kanununun “Amaç, Kapsam ve Temel Tanımlar” bölümünde yer alan tanımlara göre, “karar” deyimi aşağıdakilerden hangisini ifade eder?</w:t>
       </w:r>
     </w:p>
     <w:p>
@@ -20631,7 +20631,7 @@
         <w:t xml:space="preserve">A) </w:t>
       </w:r>
       <w:r>
-        <w:t xml:space="preserve">Rejime giriş ve rejimi kapatan gümrük idarelerinin her ikisinin de Türkiye Gümrük Bölgesinde bulunması kaydıyla, bu idarelerin birbirinden farklı olduğu durumu</w:t>
+        <w:t xml:space="preserve">Bağlayıcı tarife ve menşe bilgileri hariç olmak üzere, gümrük idaresinin belirli bir konuda bir kişi üzerinde hukuki sonuç doğuracak idari tasarrufu</w:t>
       </w:r>
     </w:p>
     <w:p>
@@ -20644,7 +20644,7 @@
         <w:t xml:space="preserve">B) </w:t>
       </w:r>
       <w:r>
-        <w:t xml:space="preserve">Rejime giriş gümrük idaresi ile denetleyici gümrük idaresinin farklı olduğu ve izin belgesinin üçüncü bir gümrük idaresince verildiği durumu</w:t>
+        <w:t xml:space="preserve">Gümrük idaresinin, belirli bir kişiye yönelmeksizin gümrük mevzuatının uygulanmasına ilişkin herkes için yayımladığı genel düzenlemeyi</w:t>
       </w:r>
     </w:p>
     <w:p>
@@ -20657,7 +20657,7 @@
         <w:t xml:space="preserve">C) </w:t>
       </w:r>
       <w:r>
-        <w:t xml:space="preserve">İşlem görmüş ürünlerin, rejime girişin yapıldığı gümrük idaresinden farklı bir gümrük idaresince serbest dolaşıma sokulduğu durumu</w:t>
+        <w:t xml:space="preserve">Gümrük idaresinin, ilgilinin talebi üzerine belirli bir eşya hakkında verdiği, hukuki sonuç doğurmayan yol gösterici bilgiyi</w:t>
       </w:r>
     </w:p>
     <w:p>
@@ -20670,7 +20670,7 @@
         <w:t xml:space="preserve">D) </w:t>
       </w:r>
       <w:r>
-        <w:t xml:space="preserve">Rejime giriş, rejimi kapatan ve denetleyici gümrük idarelerinin izin belgesinde birbirinden farklı üç idare olarak belirlendiği durumu</w:t>
+        <w:t xml:space="preserve">Gümrük idaresinin, gümrük mevzuatıyla ilgili belirli bir konuda yalnız başvuru sahibinin lehine hukuki sonuç doğuracak idari tasarrufu</w:t>
       </w:r>
     </w:p>
     <w:p>
@@ -20683,7 +20683,7 @@
         <w:t xml:space="preserve">E) </w:t>
       </w:r>
       <w:r>
-        <w:t xml:space="preserve">Gümrük idarelerinden yalnız birinin Türkiye Gümrük Bölgesinde olması kaydıyla, rejime giriş ve rejimi kapatan gümrük idarelerinin farklı olduğu durumu</w:t>
+        <w:t xml:space="preserve">Gümrük idaresinin, gümrük mevzuatıyla ilgili belirli bir konuda bir veya daha fazla kişi üzerinde hukuki sonuç doğuracak idari tasarrufu</w:t>
       </w:r>
     </w:p>
     <w:p>
@@ -20715,7 +20715,7 @@
         <w:t xml:space="preserve">📖 Açıklama: </w:t>
       </w:r>
       <w:r>
-        <w:t xml:space="preserve">Yönetmelikte üçgen trafik, gümrük idarelerinden sadece birinin Türkiye Gümrük Bölgesinde olması kaydıyla, rejime giriş gümrük idaresi ile rejimi kapatan gümrük idaresinin farklı olduğu durum olarak tanımlanmıştır. Her iki idarenin de Türkiye Gümrük Bölgesinde bulunduğu durum bu tanıma girmez; tanımda denetleyici gümrük idaresine, izni veren idareye veya idare sayısına dayalı bir ölçüt yer almaz. Bu nedenle doğru cevap E seçeneğidir. (MD GY 308/1-l; GY 308/1-a, i, j)</w:t>
+        <w:t xml:space="preserve">Kanunda karar deyimi, bağlayıcı tarife ve menşe bilgileri de dahil olmak üzere, gümrük idaresinin gümrük mevzuatı ile ilgili olarak belirli bir konuda bir veya daha fazla kişi üzerinde hukuki sonuç doğuracak idari tasarrufu olarak tanımlanmıştır. Bağlayıcı tarife ve menşe bilgileri tanımın dışında değil içindedir; karar herkese yönelik genel bir düzenleme ya da hukuki sonuç doğurmayan bir bilgi değildir ve Kanun başvuruların reddine ya da muhatabın aleyhine verilen kararları da öngördüğünden yalnız lehe tasarruflarla sınırlı değildir. Bu nedenle doğru cevap E seçeneğidir. (MD GK 3/5; GK 6/3)</w:t>
       </w:r>
     </w:p>
     <w:p>
@@ -20731,7 +20731,7 @@
         <w:t xml:space="preserve">⚖️ Yasal Dayanak: </w:t>
       </w:r>
       <w:r>
-        <w:t xml:space="preserve">Gümrük Yönetmeliği m.308/1-l (karşılaştırma: m.308/1-a, 308/1-i, 308/1-j)</w:t>
+        <w:t xml:space="preserve">4458 sayılı Gümrük Kanunu m.3/5 (karşılaştırma: m.6/3)</w:t>
       </w:r>
     </w:p>
     <w:p>
@@ -20747,7 +20747,7 @@
         <w:t xml:space="preserve">🔍 Şık Uzunluk Kontrolü: </w:t>
       </w:r>
       <w:r>
-        <w:t xml:space="preserve">A:159 B:140 C:130 D:134 E:150 karakter → Denge: UYGUN</w:t>
+        <w:t xml:space="preserve">A:148 B:134 C:124 D:134 E:136 karakter → Denge: UYGUN</w:t>
       </w:r>
     </w:p>
     <w:p>
@@ -31805,7 +31805,7 @@
         <w:spacing w:after="80" w:before="40"/>
       </w:pPr>
       <w:r>
-        <w:t xml:space="preserve">Gümrük mevzuatına göre, kamu kurumu adına tescilli beyannamede müşavirlik hizmet faturası </w:t>
+        <w:t xml:space="preserve">Asgari Ücret Tarifesine İlişkin Tebliğe göre, kamu kurumu adına tescilli beyannamede müşavirlik hizmet faturası </w:t>
       </w:r>
       <w:r>
         <w:rPr>
@@ -31985,7 +31985,7 @@
         <w:spacing w:after="80" w:before="40"/>
       </w:pPr>
       <w:r>
-        <w:t xml:space="preserve">Gümrük mevzuatına göre, asgari ücret tarifesindeki İHR-6 (ihrakiye ve kumanya) ücretleri </w:t>
+        <w:t xml:space="preserve">Asgari Ücret Tarifesine İlişkin Tebliğe göre, İHR-6 (ihrakiye ve kumanya) ücretleri </w:t>
       </w:r>
       <w:r>
         <w:rPr>
@@ -36465,7 +36465,7 @@
                 <w:sz w:val="20"/>
                 <w:szCs w:val="20"/>
               </w:rPr>
-              <w:t xml:space="preserve">10 (%13)</w:t>
+              <w:t xml:space="preserve">9 (%11)</w:t>
             </w:r>
           </w:p>
         </w:tc>
@@ -36488,7 +36488,7 @@
                 <w:sz w:val="20"/>
                 <w:szCs w:val="20"/>
               </w:rPr>
-              <w:t xml:space="preserve">40 (%50)</w:t>
+              <w:t xml:space="preserve">41 (%51)</w:t>
             </w:r>
           </w:p>
         </w:tc>
@@ -38809,7 +38809,7 @@
                 <w:sz w:val="20"/>
                 <w:szCs w:val="20"/>
               </w:rPr>
-              <w:t xml:space="preserve">Gümrük Rejimleri</w:t>
+              <w:t xml:space="preserve">Temel Tanımlar</w:t>
             </w:r>
           </w:p>
         </w:tc>
@@ -39641,6 +39641,32 @@
       </w:r>
     </w:p>
     <w:p>
+      <w:pPr>
+        <w:pStyle w:val="ListParagraph"/>
+        <w:numPr>
+          <w:ilvl w:val="0"/>
+          <w:numId w:val="2"/>
+        </w:numPr>
+        <w:spacing w:after="60"/>
+      </w:pPr>
+      <w:r>
+        <w:t xml:space="preserve">Kalite süreci: 19 yazar (15 gümrük konu kümesi + 4 genel kültür dersi) her soruyu, Deneme 6–10'daki karşılığını (“bunu da sorma”) ve kendi kümesinin hafıza satırlarını görerek yazdı. Ardından otomatik denetim yapıldı (kanıt alıntısı kaynakta birebir, uzunluk dengesi, tip ve kök kuralları, hafıza çekirdeği benzerliği). 6 bağımsız çekişmeli doğrulayıcı 86 soruda düzeltme yaptı; değişen 99 soru 2 son doğrulayıcıyla yeniden kontrol edildi (15 düzeltme). Koordinatör taramasında 400 gümrük sorusunun doğru şıkları ve öncülleri Deneme 1–10 ve 2021–2025 çıkmış sorularıyla metin metin karşılaştırıldı; doğru ifade olarak geçen hüküm bulunan sorular değiştirildi. Düzeltmeler araclar/gmy-deneme11-15/DUZELTME_LISTESI.md dosyasındadır.</w:t>
+      </w:r>
+    </w:p>
+    <w:p>
+      <w:pPr>
+        <w:pStyle w:val="ListParagraph"/>
+        <w:numPr>
+          <w:ilvl w:val="0"/>
+          <w:numId w:val="2"/>
+        </w:numPr>
+        <w:spacing w:after="60"/>
+      </w:pPr>
+      <w:r>
+        <w:t xml:space="preserve">Kaynak çapraz kontrolü ve ipucu dengesi: Kanıt alıntıları kullanıcının GitHub kaynak deposundaki Markdown mevzuat derlemesiyle (Gumrukdoktoru/2027gmynot) karşılaştırıldı. 837 alıntı parçasından 794'ü birebir, 33'ü yalnız biçim farkı ya da dönüştürmede düşen bağlantılı kelimeyle bulundu; kalan 10 parça da elle incelendi ve aynı nedenle eşleşti. Hüküm farkı çıkmadı. Öncüllü sorularda şık merdivenleri, “en sık geçen öncülleri seç” ve “ötekilere en yakın şıkkı seç” stratejilerinin isabeti şans düzeyini (%20) aşmayacak biçimde dengelendi (%19 ve %19). Cevap ipucu taraması (yakınsama, kök–şık kelime ortaklığı) 500 soruda 0 aday verdi.</w:t>
+      </w:r>
+    </w:p>
+    <w:p>
       <w:r>
         <w:br w:type="page"/>
       </w:r>
@@ -39992,7 +40018,7 @@
           <w:sz w:val="14"/>
           <w:szCs w:val="14"/>
         </w:rPr>
-        <w:t xml:space="preserve">GMY11-026 | Gümrük Rejimleri | Gümrük Yönetmeliği m.308/1-l (karşılaştırma: m.308/1-a, 308/1-i, 308/1-j) | GY 308/1-l: üçgen trafik, idarelerden yalnız biri TGB’de olmak kaydıyla rejime giriş ve rejimi kapatan gümrük idarelerinin farklı olduğu durumdur. | T4 | OÜ | E | GMY-S11</w:t>
+        <w:t xml:space="preserve">GMY11-026 | Temel Tanımlar | 4458 sayılı Gümrük Kanunu m.3/5 (karşılaştırma: m.6/3) | GK 3/5: karar, BTB ve BMB dahil, gümrük idaresinin belirli konuda bir veya daha fazla kişi üzerinde hukuki sonuç doğuracak idari tasarrufudur. | T4 | OÜ | E | GMY-S11</w:t>
       </w:r>
     </w:p>
     <w:p>

</xml_diff>